<commit_message>
some primary doing, need a lot of testing, we need to: 1 Building Dto "Constructor" to can Match with all Crud Method 2 Redoing and Correctiong all CRUD Methods One By One to matching with DTo and Building a Proffesional Thing
</commit_message>
<xml_diff>
--- a/الحمد لله تم اكمال Generator Code.docx
+++ b/الحمد لله تم اكمال Generator Code.docx
@@ -1,6 +1,6 @@
 
 <file path=word/document.xml><?xml version="1.0" encoding="utf-8"?>
-<w:document xmlns:wpc="http://schemas.microsoft.com/office/word/2010/wordprocessingCanvas" xmlns:cx="http://schemas.microsoft.com/office/drawing/2014/chartex" xmlns:cx1="http://schemas.microsoft.com/office/drawing/2015/9/8/chartex" xmlns:mc="http://schemas.openxmlformats.org/markup-compatibility/2006" xmlns:o="urn:schemas-microsoft-com:office:office" xmlns:r="http://schemas.openxmlformats.org/officeDocument/2006/relationships" xmlns:m="http://schemas.openxmlformats.org/officeDocument/2006/math" xmlns:v="urn:schemas-microsoft-com:vml" xmlns:wp14="http://schemas.microsoft.com/office/word/2010/wordprocessingDrawing" xmlns:wp="http://schemas.openxmlformats.org/drawingml/2006/wordprocessingDrawing" xmlns:w10="urn:schemas-microsoft-com:office:word" xmlns:w="http://schemas.openxmlformats.org/wordprocessingml/2006/main" xmlns:w14="http://schemas.microsoft.com/office/word/2010/wordml" xmlns:w15="http://schemas.microsoft.com/office/word/2012/wordml" xmlns:w16se="http://schemas.microsoft.com/office/word/2015/wordml/symex" xmlns:wpg="http://schemas.microsoft.com/office/word/2010/wordprocessingGroup" xmlns:wpi="http://schemas.microsoft.com/office/word/2010/wordprocessingInk" xmlns:wne="http://schemas.microsoft.com/office/word/2006/wordml" xmlns:wps="http://schemas.microsoft.com/office/word/2010/wordprocessingShape" mc:Ignorable="w14 w15 w16se wp14">
+<w:document xmlns:wpc="http://schemas.microsoft.com/office/word/2010/wordprocessingCanvas" xmlns:cx="http://schemas.microsoft.com/office/drawing/2014/chartex" xmlns:cx1="http://schemas.microsoft.com/office/drawing/2015/9/8/chartex" xmlns:cx2="http://schemas.microsoft.com/office/drawing/2015/10/21/chartex" xmlns:cx3="http://schemas.microsoft.com/office/drawing/2016/5/9/chartex" xmlns:cx4="http://schemas.microsoft.com/office/drawing/2016/5/10/chartex" xmlns:cx5="http://schemas.microsoft.com/office/drawing/2016/5/11/chartex" xmlns:cx6="http://schemas.microsoft.com/office/drawing/2016/5/12/chartex" xmlns:cx7="http://schemas.microsoft.com/office/drawing/2016/5/13/chartex" xmlns:cx8="http://schemas.microsoft.com/office/drawing/2016/5/14/chartex" xmlns:mc="http://schemas.openxmlformats.org/markup-compatibility/2006" xmlns:aink="http://schemas.microsoft.com/office/drawing/2016/ink" xmlns:am3d="http://schemas.microsoft.com/office/drawing/2017/model3d" xmlns:o="urn:schemas-microsoft-com:office:office" xmlns:oel="http://schemas.microsoft.com/office/2019/extlst" xmlns:r="http://schemas.openxmlformats.org/officeDocument/2006/relationships" xmlns:m="http://schemas.openxmlformats.org/officeDocument/2006/math" xmlns:v="urn:schemas-microsoft-com:vml" xmlns:wp14="http://schemas.microsoft.com/office/word/2010/wordprocessingDrawing" xmlns:wp="http://schemas.openxmlformats.org/drawingml/2006/wordprocessingDrawing" xmlns:w10="urn:schemas-microsoft-com:office:word" xmlns:w="http://schemas.openxmlformats.org/wordprocessingml/2006/main" xmlns:w14="http://schemas.microsoft.com/office/word/2010/wordml" xmlns:w15="http://schemas.microsoft.com/office/word/2012/wordml" xmlns:w16cex="http://schemas.microsoft.com/office/word/2018/wordml/cex" xmlns:w16cid="http://schemas.microsoft.com/office/word/2016/wordml/cid" xmlns:w16="http://schemas.microsoft.com/office/word/2018/wordml" xmlns:w16du="http://schemas.microsoft.com/office/word/2023/wordml/word16du" xmlns:w16sdtdh="http://schemas.microsoft.com/office/word/2020/wordml/sdtdatahash" xmlns:w16sdtfl="http://schemas.microsoft.com/office/word/2024/wordml/sdtformatlock" xmlns:w16se="http://schemas.microsoft.com/office/word/2015/wordml/symex" xmlns:wpg="http://schemas.microsoft.com/office/word/2010/wordprocessingGroup" xmlns:wpi="http://schemas.microsoft.com/office/word/2010/wordprocessingInk" xmlns:wne="http://schemas.microsoft.com/office/word/2006/wordml" xmlns:wps="http://schemas.microsoft.com/office/word/2010/wordprocessingShape" mc:Ignorable="w14 w15 w16se w16cid w16 w16cex w16sdtdh w16sdtfl w16du wp14">
   <w:body>
     <w:p>
       <w:pPr>
@@ -10,7 +10,6 @@
           <w:lang w:bidi="ar-MA"/>
         </w:rPr>
       </w:pPr>
-      <w:bookmarkStart w:id="0" w:name="_GoBack"/>
       <w:r>
         <w:rPr>
           <w:rFonts w:hint="cs"/>
@@ -52,7 +51,6 @@
       <w:pPr>
         <w:bidi/>
         <w:rPr>
-          <w:rFonts w:hint="cs"/>
           <w:rtl/>
           <w:lang w:bidi="ar-MA"/>
         </w:rPr>
@@ -419,63 +417,21 @@
         </w:rPr>
         <w:t xml:space="preserve">رابطه في </w:t>
       </w:r>
-      <w:r>
-        <w:rPr>
-          <w:lang w:bidi="ar-MA"/>
-        </w:rPr>
-        <w:fldChar w:fldCharType="begin"/>
-      </w:r>
-      <w:r>
-        <w:rPr>
-          <w:lang w:bidi="ar-MA"/>
-        </w:rPr>
-        <w:instrText xml:space="preserve"> HYPERLINK "</w:instrText>
-      </w:r>
-      <w:r>
-        <w:rPr>
-          <w:lang w:bidi="ar-MA"/>
-        </w:rPr>
-        <w:instrText>https://github.com/zakariaskalli/BizDataLayerGenProject.git</w:instrText>
-      </w:r>
-      <w:r>
-        <w:rPr>
-          <w:lang w:bidi="ar-MA"/>
-        </w:rPr>
-        <w:instrText xml:space="preserve">" </w:instrText>
-      </w:r>
-      <w:r>
-        <w:rPr>
-          <w:lang w:bidi="ar-MA"/>
-        </w:rPr>
-        <w:fldChar w:fldCharType="separate"/>
-      </w:r>
-      <w:r>
-        <w:rPr>
-          <w:rStyle w:val="Hyperlink"/>
-          <w:lang w:bidi="ar-MA"/>
-        </w:rPr>
-        <w:t>https://github.com/zakariaskalli/BizDataLayerGenProject.git</w:t>
-      </w:r>
-      <w:r>
-        <w:rPr>
-          <w:lang w:bidi="ar-MA"/>
-        </w:rPr>
-        <w:fldChar w:fldCharType="end"/>
-      </w:r>
-      <w:r>
-        <w:rPr>
-          <w:lang w:bidi="ar-MA"/>
-        </w:rPr>
-        <w:t xml:space="preserve"> :</w:t>
-      </w:r>
-      <w:proofErr w:type="spellStart"/>
-      <w:r>
-        <w:rPr>
-          <w:lang w:bidi="ar-MA"/>
-        </w:rPr>
-        <w:t>github</w:t>
-      </w:r>
-      <w:proofErr w:type="spellEnd"/>
+      <w:hyperlink r:id="rId6" w:history="1">
+        <w:r>
+          <w:rPr>
+            <w:rStyle w:val="Hyperlink"/>
+            <w:lang w:bidi="ar-MA"/>
+          </w:rPr>
+          <w:t>https://github.com/zakariaskalli/BizDataLayerGenProject.git</w:t>
+        </w:r>
+      </w:hyperlink>
+      <w:r>
+        <w:rPr>
+          <w:lang w:bidi="ar-MA"/>
+        </w:rPr>
+        <w:t xml:space="preserve"> :github</w:t>
+      </w:r>
     </w:p>
     <w:p>
       <w:pPr>
@@ -505,6 +461,7 @@
       <w:pPr>
         <w:bidi/>
         <w:rPr>
+          <w:rtl/>
           <w:lang w:bidi="ar-MA"/>
         </w:rPr>
       </w:pPr>
@@ -516,7 +473,124 @@
         </w:rPr>
         <w:t>أنا أنتظر رأيكم وملاحظاتكم عليه والسلام عليكم</w:t>
       </w:r>
-      <w:bookmarkEnd w:id="0"/>
+    </w:p>
+    <w:p>
+      <w:pPr>
+        <w:bidi/>
+        <w:rPr>
+          <w:rtl/>
+          <w:lang w:bidi="ar-MA"/>
+        </w:rPr>
+      </w:pPr>
+    </w:p>
+    <w:p>
+      <w:pPr>
+        <w:bidi/>
+        <w:rPr>
+          <w:rtl/>
+          <w:lang w:bidi="ar-MA"/>
+        </w:rPr>
+      </w:pPr>
+    </w:p>
+    <w:p>
+      <w:pPr>
+        <w:bidi/>
+        <w:rPr>
+          <w:rtl/>
+          <w:lang w:bidi="ar-MA"/>
+        </w:rPr>
+      </w:pPr>
+      <w:r>
+        <w:rPr>
+          <w:rFonts w:hint="cs"/>
+          <w:rtl/>
+          <w:lang w:bidi="ar-MA"/>
+        </w:rPr>
+        <w:t>إضافات:</w:t>
+      </w:r>
+    </w:p>
+    <w:p>
+      <w:pPr>
+        <w:pStyle w:val="ListParagraph"/>
+        <w:numPr>
+          <w:ilvl w:val="0"/>
+          <w:numId w:val="4"/>
+        </w:numPr>
+        <w:bidi/>
+        <w:rPr>
+          <w:lang w:bidi="ar-MA"/>
+        </w:rPr>
+      </w:pPr>
+      <w:r>
+        <w:rPr>
+          <w:rFonts w:hint="cs"/>
+          <w:rtl/>
+          <w:lang w:bidi="ar-MA"/>
+        </w:rPr>
+        <w:t xml:space="preserve">في نسخة </w:t>
+      </w:r>
+      <w:r>
+        <w:rPr>
+          <w:lang w:bidi="ar-MA"/>
+        </w:rPr>
+        <w:t xml:space="preserve">ADO.Net with 3 tier architecture </w:t>
+      </w:r>
+      <w:r>
+        <w:rPr>
+          <w:rFonts w:hint="cs"/>
+          <w:rtl/>
+          <w:lang w:val="fr-FR" w:bidi="ar-MA"/>
+        </w:rPr>
+        <w:t xml:space="preserve"> في </w:t>
+      </w:r>
+      <w:r>
+        <w:rPr>
+          <w:lang w:bidi="ar-MA"/>
+        </w:rPr>
+        <w:t xml:space="preserve">BL </w:t>
+      </w:r>
+      <w:r>
+        <w:rPr>
+          <w:rFonts w:hint="cs"/>
+          <w:rtl/>
+          <w:lang w:val="fr-FR" w:bidi="ar-MA"/>
+        </w:rPr>
+        <w:t xml:space="preserve"> اعمل في </w:t>
+      </w:r>
+      <w:r>
+        <w:rPr>
+          <w:lang w:bidi="ar-MA"/>
+        </w:rPr>
+        <w:t xml:space="preserve">Constructors </w:t>
+      </w:r>
+      <w:r>
+        <w:rPr>
+          <w:rFonts w:hint="cs"/>
+          <w:rtl/>
+          <w:lang w:val="fr-FR" w:bidi="ar-MA"/>
+        </w:rPr>
+        <w:t xml:space="preserve"> في </w:t>
+      </w:r>
+      <w:r>
+        <w:rPr>
+          <w:lang w:bidi="ar-MA"/>
+        </w:rPr>
+        <w:t xml:space="preserve">initialization </w:t>
+      </w:r>
+      <w:r>
+        <w:rPr>
+          <w:rFonts w:hint="cs"/>
+          <w:rtl/>
+          <w:lang w:val="fr-FR" w:bidi="ar-MA"/>
+        </w:rPr>
+        <w:t xml:space="preserve"> اعمل </w:t>
+      </w:r>
+      <w:r>
+        <w:rPr>
+          <w:lang w:bidi="ar-MA"/>
+        </w:rPr>
+        <w:t>{ get; set; }</w:t>
+      </w:r>
     </w:p>
     <w:sectPr>
       <w:pgSz w:w="12240" w:h="15840"/>
@@ -529,7 +603,7 @@
 </file>
 
 <file path=word/numbering.xml><?xml version="1.0" encoding="utf-8"?>
-<w:numbering xmlns:wpc="http://schemas.microsoft.com/office/word/2010/wordprocessingCanvas" xmlns:cx="http://schemas.microsoft.com/office/drawing/2014/chartex" xmlns:cx1="http://schemas.microsoft.com/office/drawing/2015/9/8/chartex" xmlns:mc="http://schemas.openxmlformats.org/markup-compatibility/2006" xmlns:o="urn:schemas-microsoft-com:office:office" xmlns:r="http://schemas.openxmlformats.org/officeDocument/2006/relationships" xmlns:m="http://schemas.openxmlformats.org/officeDocument/2006/math" xmlns:v="urn:schemas-microsoft-com:vml" xmlns:wp14="http://schemas.microsoft.com/office/word/2010/wordprocessingDrawing" xmlns:wp="http://schemas.openxmlformats.org/drawingml/2006/wordprocessingDrawing" xmlns:w10="urn:schemas-microsoft-com:office:word" xmlns:w="http://schemas.openxmlformats.org/wordprocessingml/2006/main" xmlns:w14="http://schemas.microsoft.com/office/word/2010/wordml" xmlns:w15="http://schemas.microsoft.com/office/word/2012/wordml" xmlns:w16se="http://schemas.microsoft.com/office/word/2015/wordml/symex" xmlns:wpg="http://schemas.microsoft.com/office/word/2010/wordprocessingGroup" xmlns:wpi="http://schemas.microsoft.com/office/word/2010/wordprocessingInk" xmlns:wne="http://schemas.microsoft.com/office/word/2006/wordml" xmlns:wps="http://schemas.microsoft.com/office/word/2010/wordprocessingShape" mc:Ignorable="w14 w15 w16se wp14">
+<w:numbering xmlns:wpc="http://schemas.microsoft.com/office/word/2010/wordprocessingCanvas" xmlns:cx="http://schemas.microsoft.com/office/drawing/2014/chartex" xmlns:cx1="http://schemas.microsoft.com/office/drawing/2015/9/8/chartex" xmlns:cx2="http://schemas.microsoft.com/office/drawing/2015/10/21/chartex" xmlns:cx3="http://schemas.microsoft.com/office/drawing/2016/5/9/chartex" xmlns:cx4="http://schemas.microsoft.com/office/drawing/2016/5/10/chartex" xmlns:cx5="http://schemas.microsoft.com/office/drawing/2016/5/11/chartex" xmlns:cx6="http://schemas.microsoft.com/office/drawing/2016/5/12/chartex" xmlns:cx7="http://schemas.microsoft.com/office/drawing/2016/5/13/chartex" xmlns:cx8="http://schemas.microsoft.com/office/drawing/2016/5/14/chartex" xmlns:mc="http://schemas.openxmlformats.org/markup-compatibility/2006" xmlns:aink="http://schemas.microsoft.com/office/drawing/2016/ink" xmlns:am3d="http://schemas.microsoft.com/office/drawing/2017/model3d" xmlns:o="urn:schemas-microsoft-com:office:office" xmlns:oel="http://schemas.microsoft.com/office/2019/extlst" xmlns:r="http://schemas.openxmlformats.org/officeDocument/2006/relationships" xmlns:m="http://schemas.openxmlformats.org/officeDocument/2006/math" xmlns:v="urn:schemas-microsoft-com:vml" xmlns:wp14="http://schemas.microsoft.com/office/word/2010/wordprocessingDrawing" xmlns:wp="http://schemas.openxmlformats.org/drawingml/2006/wordprocessingDrawing" xmlns:w10="urn:schemas-microsoft-com:office:word" xmlns:w="http://schemas.openxmlformats.org/wordprocessingml/2006/main" xmlns:w14="http://schemas.microsoft.com/office/word/2010/wordml" xmlns:w15="http://schemas.microsoft.com/office/word/2012/wordml" xmlns:w16cex="http://schemas.microsoft.com/office/word/2018/wordml/cex" xmlns:w16cid="http://schemas.microsoft.com/office/word/2016/wordml/cid" xmlns:w16="http://schemas.microsoft.com/office/word/2018/wordml" xmlns:w16du="http://schemas.microsoft.com/office/word/2023/wordml/word16du" xmlns:w16sdtdh="http://schemas.microsoft.com/office/word/2020/wordml/sdtdatahash" xmlns:w16sdtfl="http://schemas.microsoft.com/office/word/2024/wordml/sdtformatlock" xmlns:w16se="http://schemas.microsoft.com/office/word/2015/wordml/symex" xmlns:wpg="http://schemas.microsoft.com/office/word/2010/wordprocessingGroup" xmlns:wpi="http://schemas.microsoft.com/office/word/2010/wordprocessingInk" xmlns:wne="http://schemas.microsoft.com/office/word/2006/wordml" xmlns:wps="http://schemas.microsoft.com/office/word/2010/wordprocessingShape" mc:Ignorable="w14 w15 w16se w16cid w16 w16cex w16sdtdh w16sdtfl w16du wp14">
   <w:abstractNum w:abstractNumId="0" w15:restartNumberingAfterBreak="0">
     <w:nsid w:val="26235855"/>
     <w:multiLevelType w:val="hybridMultilevel"/>
@@ -757,6 +831,118 @@
     </w:lvl>
   </w:abstractNum>
   <w:abstractNum w:abstractNumId="2" w15:restartNumberingAfterBreak="0">
+    <w:nsid w:val="3C9D136D"/>
+    <w:multiLevelType w:val="hybridMultilevel"/>
+    <w:tmpl w:val="0E6EF2F0"/>
+    <w:lvl w:ilvl="0" w:tplc="7ABE64F2">
+      <w:numFmt w:val="bullet"/>
+      <w:lvlText w:val="-"/>
+      <w:lvlJc w:val="left"/>
+      <w:pPr>
+        <w:ind w:left="720" w:hanging="360"/>
+      </w:pPr>
+      <w:rPr>
+        <w:rFonts w:ascii="Arial" w:eastAsiaTheme="minorHAnsi" w:hAnsi="Arial" w:cs="Arial" w:hint="default"/>
+      </w:rPr>
+    </w:lvl>
+    <w:lvl w:ilvl="1" w:tplc="040C0003" w:tentative="1">
+      <w:start w:val="1"/>
+      <w:numFmt w:val="bullet"/>
+      <w:lvlText w:val="o"/>
+      <w:lvlJc w:val="left"/>
+      <w:pPr>
+        <w:ind w:left="1440" w:hanging="360"/>
+      </w:pPr>
+      <w:rPr>
+        <w:rFonts w:ascii="Courier New" w:hAnsi="Courier New" w:cs="Courier New" w:hint="default"/>
+      </w:rPr>
+    </w:lvl>
+    <w:lvl w:ilvl="2" w:tplc="040C0005" w:tentative="1">
+      <w:start w:val="1"/>
+      <w:numFmt w:val="bullet"/>
+      <w:lvlText w:val=""/>
+      <w:lvlJc w:val="left"/>
+      <w:pPr>
+        <w:ind w:left="2160" w:hanging="360"/>
+      </w:pPr>
+      <w:rPr>
+        <w:rFonts w:ascii="Wingdings" w:hAnsi="Wingdings" w:hint="default"/>
+      </w:rPr>
+    </w:lvl>
+    <w:lvl w:ilvl="3" w:tplc="040C0001" w:tentative="1">
+      <w:start w:val="1"/>
+      <w:numFmt w:val="bullet"/>
+      <w:lvlText w:val=""/>
+      <w:lvlJc w:val="left"/>
+      <w:pPr>
+        <w:ind w:left="2880" w:hanging="360"/>
+      </w:pPr>
+      <w:rPr>
+        <w:rFonts w:ascii="Symbol" w:hAnsi="Symbol" w:hint="default"/>
+      </w:rPr>
+    </w:lvl>
+    <w:lvl w:ilvl="4" w:tplc="040C0003" w:tentative="1">
+      <w:start w:val="1"/>
+      <w:numFmt w:val="bullet"/>
+      <w:lvlText w:val="o"/>
+      <w:lvlJc w:val="left"/>
+      <w:pPr>
+        <w:ind w:left="3600" w:hanging="360"/>
+      </w:pPr>
+      <w:rPr>
+        <w:rFonts w:ascii="Courier New" w:hAnsi="Courier New" w:cs="Courier New" w:hint="default"/>
+      </w:rPr>
+    </w:lvl>
+    <w:lvl w:ilvl="5" w:tplc="040C0005" w:tentative="1">
+      <w:start w:val="1"/>
+      <w:numFmt w:val="bullet"/>
+      <w:lvlText w:val=""/>
+      <w:lvlJc w:val="left"/>
+      <w:pPr>
+        <w:ind w:left="4320" w:hanging="360"/>
+      </w:pPr>
+      <w:rPr>
+        <w:rFonts w:ascii="Wingdings" w:hAnsi="Wingdings" w:hint="default"/>
+      </w:rPr>
+    </w:lvl>
+    <w:lvl w:ilvl="6" w:tplc="040C0001" w:tentative="1">
+      <w:start w:val="1"/>
+      <w:numFmt w:val="bullet"/>
+      <w:lvlText w:val=""/>
+      <w:lvlJc w:val="left"/>
+      <w:pPr>
+        <w:ind w:left="5040" w:hanging="360"/>
+      </w:pPr>
+      <w:rPr>
+        <w:rFonts w:ascii="Symbol" w:hAnsi="Symbol" w:hint="default"/>
+      </w:rPr>
+    </w:lvl>
+    <w:lvl w:ilvl="7" w:tplc="040C0003" w:tentative="1">
+      <w:start w:val="1"/>
+      <w:numFmt w:val="bullet"/>
+      <w:lvlText w:val="o"/>
+      <w:lvlJc w:val="left"/>
+      <w:pPr>
+        <w:ind w:left="5760" w:hanging="360"/>
+      </w:pPr>
+      <w:rPr>
+        <w:rFonts w:ascii="Courier New" w:hAnsi="Courier New" w:cs="Courier New" w:hint="default"/>
+      </w:rPr>
+    </w:lvl>
+    <w:lvl w:ilvl="8" w:tplc="040C0005" w:tentative="1">
+      <w:start w:val="1"/>
+      <w:numFmt w:val="bullet"/>
+      <w:lvlText w:val=""/>
+      <w:lvlJc w:val="left"/>
+      <w:pPr>
+        <w:ind w:left="6480" w:hanging="360"/>
+      </w:pPr>
+      <w:rPr>
+        <w:rFonts w:ascii="Wingdings" w:hAnsi="Wingdings" w:hint="default"/>
+      </w:rPr>
+    </w:lvl>
+  </w:abstractNum>
+  <w:abstractNum w:abstractNumId="3" w15:restartNumberingAfterBreak="0">
     <w:nsid w:val="55781F94"/>
     <w:multiLevelType w:val="hybridMultilevel"/>
     <w:tmpl w:val="376ED00C"/>
@@ -869,20 +1055,23 @@
       </w:rPr>
     </w:lvl>
   </w:abstractNum>
-  <w:num w:numId="1">
-    <w:abstractNumId w:val="2"/>
+  <w:num w:numId="1" w16cid:durableId="771903094">
+    <w:abstractNumId w:val="3"/>
   </w:num>
-  <w:num w:numId="2">
+  <w:num w:numId="2" w16cid:durableId="871650336">
     <w:abstractNumId w:val="0"/>
   </w:num>
-  <w:num w:numId="3">
+  <w:num w:numId="3" w16cid:durableId="1219437728">
     <w:abstractNumId w:val="1"/>
+  </w:num>
+  <w:num w:numId="4" w16cid:durableId="19936060">
+    <w:abstractNumId w:val="2"/>
   </w:num>
 </w:numbering>
 </file>
 
 <file path=word/styles.xml><?xml version="1.0" encoding="utf-8"?>
-<w:styles xmlns:mc="http://schemas.openxmlformats.org/markup-compatibility/2006" xmlns:r="http://schemas.openxmlformats.org/officeDocument/2006/relationships" xmlns:w="http://schemas.openxmlformats.org/wordprocessingml/2006/main" xmlns:w14="http://schemas.microsoft.com/office/word/2010/wordml" xmlns:w15="http://schemas.microsoft.com/office/word/2012/wordml" xmlns:w16se="http://schemas.microsoft.com/office/word/2015/wordml/symex" mc:Ignorable="w14 w15 w16se">
+<w:styles xmlns:mc="http://schemas.openxmlformats.org/markup-compatibility/2006" xmlns:r="http://schemas.openxmlformats.org/officeDocument/2006/relationships" xmlns:w="http://schemas.openxmlformats.org/wordprocessingml/2006/main" xmlns:w14="http://schemas.microsoft.com/office/word/2010/wordml" xmlns:w15="http://schemas.microsoft.com/office/word/2012/wordml" xmlns:w16cex="http://schemas.microsoft.com/office/word/2018/wordml/cex" xmlns:w16cid="http://schemas.microsoft.com/office/word/2016/wordml/cid" xmlns:w16="http://schemas.microsoft.com/office/word/2018/wordml" xmlns:w16du="http://schemas.microsoft.com/office/word/2023/wordml/word16du" xmlns:w16sdtdh="http://schemas.microsoft.com/office/word/2020/wordml/sdtdatahash" xmlns:w16sdtfl="http://schemas.microsoft.com/office/word/2024/wordml/sdtformatlock" xmlns:w16se="http://schemas.microsoft.com/office/word/2015/wordml/symex" mc:Ignorable="w14 w15 w16se w16cid w16 w16cex w16sdtdh w16sdtfl w16du">
   <w:docDefaults>
     <w:rPrDefault>
       <w:rPr>
@@ -898,7 +1087,7 @@
       </w:pPr>
     </w:pPrDefault>
   </w:docDefaults>
-  <w:latentStyles w:defLockedState="0" w:defUIPriority="99" w:defSemiHidden="0" w:defUnhideWhenUsed="0" w:defQFormat="0" w:count="371">
+  <w:latentStyles w:defLockedState="0" w:defUIPriority="99" w:defSemiHidden="0" w:defUnhideWhenUsed="0" w:defQFormat="0" w:count="376">
     <w:lsdException w:name="Normal" w:uiPriority="0" w:qFormat="1"/>
     <w:lsdException w:name="heading 1" w:uiPriority="9" w:qFormat="1"/>
     <w:lsdException w:name="heading 2" w:semiHidden="1" w:uiPriority="9" w:unhideWhenUsed="1" w:qFormat="1"/>
@@ -1270,6 +1459,11 @@
     <w:lsdException w:name="List Table 5 Dark Accent 6" w:uiPriority="50"/>
     <w:lsdException w:name="List Table 6 Colorful Accent 6" w:uiPriority="51"/>
     <w:lsdException w:name="List Table 7 Colorful Accent 6" w:uiPriority="52"/>
+    <w:lsdException w:name="Mention" w:semiHidden="1" w:unhideWhenUsed="1"/>
+    <w:lsdException w:name="Smart Hyperlink" w:semiHidden="1" w:unhideWhenUsed="1"/>
+    <w:lsdException w:name="Hashtag" w:semiHidden="1" w:unhideWhenUsed="1"/>
+    <w:lsdException w:name="Unresolved Mention" w:semiHidden="1" w:unhideWhenUsed="1"/>
+    <w:lsdException w:name="Smart Link" w:semiHidden="1" w:unhideWhenUsed="1"/>
   </w:latentStyles>
   <w:style w:type="paragraph" w:default="1" w:styleId="Normal">
     <w:name w:val="Normal"/>
@@ -1278,7 +1472,6 @@
   <w:style w:type="character" w:default="1" w:styleId="DefaultParagraphFont">
     <w:name w:val="Default Paragraph Font"/>
     <w:uiPriority w:val="1"/>
-    <w:semiHidden/>
     <w:unhideWhenUsed/>
   </w:style>
   <w:style w:type="table" w:default="1" w:styleId="TableNormal">

</xml_diff>